<commit_message>
Los pies dicen quién tomó cada captura
Las seis primeras evidencias no se hicieron a mano: las toma la suite de Cypress
mientras juega, y eso cambia lo que valen. Una captura hecha a mano demuestra
que algo funcionó una vez; una que genera la prueba demuestra que funciona en
cada ejecución, y se regenera sola cuando el sistema cambia. Ahora cada pie dice
qué prueba la tomó, y el texto lo explica una vez.

La figura del pipeline pasa a titularse por lo que es, «Jenkins — el pipeline por
dentro», para que no se confunda con la del panel de construcciones.

Co-Authored-By: Claude Opus 5 <noreply@anthropic.com>
Claude-Session: https://claude.ai/code/session_01Lqzm1XWVmDmairA1UmcXSG
</commit_message>
<xml_diff>
--- a/docs/vv/informe-final.docx
+++ b/docs/vv/informe-final.docx
@@ -2772,6 +2772,23 @@
       </w:pPr>
       <w:r>
         <w:t>5. Evidencias visuales</w:t>
+      </w:r>
+    </w:p>
+    <w:p>
+      <w:pPr>
+        <w:pStyle w:val="APABodyText"/>
+      </w:pPr>
+      <w:r>
+        <w:t xml:space="preserve">Las seis primeras capturas no se hicieron a mano: </w:t>
+      </w:r>
+      <w:r>
+        <w:rPr>
+          <w:b/>
+        </w:rPr>
+        <w:t>las toma la propia suite de Cypress mientras juega</w:t>
+      </w:r>
+      <w:r>
+        <w:t>, así que se regeneran solas en cada ejecución y no pueden quedarse desfasadas respecto al sistema.</w:t>
       </w:r>
     </w:p>
     <w:p>
@@ -2823,7 +2840,7 @@
           <w:i/>
           <w:sz w:val="18"/>
         </w:rPr>
-        <w:t>Figura 1. Pantalla de entrada. Se crea sala o se entra con un código de cuatro caracteres.</w:t>
+        <w:t>Figura 1. Capturada por la prueba de Cypress «menú principal». Pantalla de entrada: se crea sala o se entra con un código de cuatro caracteres.</w:t>
       </w:r>
     </w:p>
     <w:p>
@@ -2875,7 +2892,7 @@
           <w:i/>
           <w:sz w:val="18"/>
         </w:rPr>
-        <w:t>Figura 2. Mesa repartida: siete cartas, mazo, pozo y turno en curso.</w:t>
+        <w:t>Figura 2. Capturada por la prueba de Cypress «partida local». Mesa repartida: siete cartas, mazo, pozo y turno en curso.</w:t>
       </w:r>
     </w:p>
     <w:p>
@@ -2927,7 +2944,7 @@
           <w:i/>
           <w:sz w:val="18"/>
         </w:rPr>
-        <w:t>Figura 3. Tres navegadores reales con WebRTC: las tres réplicas publican la misma huella de estado.</w:t>
+        <w:t>Figura 3. Capturada por la prueba de Cypress «malla de tres nodos». Tres navegadores reales con WebRTC: las tres réplicas publican la misma huella de estado.</w:t>
       </w:r>
     </w:p>
     <w:p>
@@ -2979,7 +2996,7 @@
           <w:i/>
           <w:sz w:val="18"/>
         </w:rPr>
-        <w:t>Figura 4. Tolerancia a fallos: cae un nodo y los demás siguen jugando.</w:t>
+        <w:t>Figura 4. Capturada por la prueba de Cypress «malla de tres nodos». Tolerancia a fallos: cae un nodo y los demás siguen jugando.</w:t>
       </w:r>
     </w:p>
     <w:p>
@@ -3031,7 +3048,7 @@
           <w:i/>
           <w:sz w:val="18"/>
         </w:rPr>
-        <w:t>Figura 5. Pantalla Maestra: líder, testigo, convergencia, huella de cada nodo e historial de la malla. Es la verificación en vivo de que todos ven la misma partida.</w:t>
+        <w:t>Figura 5. Capturada por la prueba de Cypress «malla de tres nodos». La Pantalla Maestra: líder, testigo, convergencia, huella de cada nodo e historial de la malla.</w:t>
       </w:r>
     </w:p>
     <w:p>
@@ -3083,7 +3100,7 @@
           <w:i/>
           <w:sz w:val="18"/>
         </w:rPr>
-        <w:t>Figura 6. Aforo: diez navegadores en la misma sala, 45 conexiones directas.</w:t>
+        <w:t>Figura 6. Capturada por la prueba de Cypress «aforo: diez caben, el once no». Diez navegadores en la misma sala, 45 conexiones directas.</w:t>
       </w:r>
     </w:p>
     <w:p>
@@ -3239,7 +3256,7 @@
           <w:i/>
           <w:sz w:val="18"/>
         </w:rPr>
-        <w:t>Figura 9. El pipeline por dentro: se define desde el propio repositorio (Pipeline script from SCM), así que las siete etapas viven en el `Jenkinsfile` y no en la configuración del servidor.</w:t>
+        <w:t>Figura 9. Jenkins — el pipeline por dentro. Se define como «Pipeline script from SCM», así que las siete etapas viven en el Jenkinsfile del repositorio y no en la configuración del servidor.</w:t>
       </w:r>
     </w:p>
     <w:p>

</xml_diff>

<commit_message>
Las tres consolas: la suite verde, la malla sola y la validación distribuida
Faltaba la evidencia más simple de todas y la que primero pide cualquiera: la
salida en consola. Ahora el informe la lleva.

  · la suite completa — 4 archivos, 22 pruebas, 22 pasadas, 0 fallos, 5:43;
  · la prueba de la malla ejecutada sola, con las tres capturas que deja escritas
    (esas mismas son las figuras 3, 4 y 5 del documento, así que se ve de dónde
    salen);
  · la validación distribuida, con las mediciones de coste a 3, 5 y 10 nodos y
    7/7 propiedades.

Correr un archivo suelto volvió a dejar capturas en una carpeta equivocada
(`cypress/malla.cy.ts/` en vez de `cypress/distribuido/malla.cy.ts/`). Limpiado y
restaurado desde git; el comprobador ya vigila 21 evidencias.

Co-Authored-By: Claude Opus 5 <noreply@anthropic.com>
Claude-Session: https://claude.ai/code/session_01Lqzm1XWVmDmairA1UmcXSG
</commit_message>
<xml_diff>
--- a/docs/vv/informe-final.docx
+++ b/docs/vv/informe-final.docx
@@ -3266,8 +3266,164 @@
       <w:r>
         <w:drawing>
           <wp:inline xmlns:a="http://schemas.openxmlformats.org/drawingml/2006/main" xmlns:pic="http://schemas.openxmlformats.org/drawingml/2006/picture">
+            <wp:extent cx="5040000" cy="2522178"/>
+            <wp:docPr id="10" name="Picture 10"/>
+            <wp:cNvGraphicFramePr>
+              <a:graphicFrameLocks noChangeAspect="1"/>
+            </wp:cNvGraphicFramePr>
+            <a:graphic>
+              <a:graphicData uri="http://schemas.openxmlformats.org/drawingml/2006/picture">
+                <pic:pic>
+                  <pic:nvPicPr>
+                    <pic:cNvPr id="0" name="13-cypress-consola-suite.png"/>
+                    <pic:cNvPicPr/>
+                  </pic:nvPicPr>
+                  <pic:blipFill>
+                    <a:blip r:embed="rId25"/>
+                    <a:stretch>
+                      <a:fillRect/>
+                    </a:stretch>
+                  </pic:blipFill>
+                  <pic:spPr>
+                    <a:xfrm>
+                      <a:off x="0" y="0"/>
+                      <a:ext cx="5040000" cy="2522178"/>
+                    </a:xfrm>
+                    <a:prstGeom prst="rect"/>
+                  </pic:spPr>
+                </pic:pic>
+              </a:graphicData>
+            </a:graphic>
+          </wp:inline>
+        </w:drawing>
+      </w:r>
+    </w:p>
+    <w:p>
+      <w:pPr>
+        <w:pStyle w:val="APAGraphorFigure"/>
+        <w:jc w:val="center"/>
+      </w:pPr>
+      <w:r>
+        <w:rPr>
+          <w:i/>
+          <w:sz w:val="18"/>
+        </w:rPr>
+        <w:t>Figura 10. La suite completa ejecutándose en consola: los cuatro archivos, 22 pruebas, 22 pasadas, 0 fallos, en 5 minutos y 43 segundos.</w:t>
+      </w:r>
+    </w:p>
+    <w:p>
+      <w:pPr>
+        <w:jc w:val="center"/>
+      </w:pPr>
+      <w:r>
+        <w:drawing>
+          <wp:inline xmlns:a="http://schemas.openxmlformats.org/drawingml/2006/main" xmlns:pic="http://schemas.openxmlformats.org/drawingml/2006/picture">
+            <wp:extent cx="5040000" cy="2619931"/>
+            <wp:docPr id="11" name="Picture 11"/>
+            <wp:cNvGraphicFramePr>
+              <a:graphicFrameLocks noChangeAspect="1"/>
+            </wp:cNvGraphicFramePr>
+            <a:graphic>
+              <a:graphicData uri="http://schemas.openxmlformats.org/drawingml/2006/picture">
+                <pic:pic>
+                  <pic:nvPicPr>
+                    <pic:cNvPr id="0" name="14-cypress-consola-malla.png"/>
+                    <pic:cNvPicPr/>
+                  </pic:nvPicPr>
+                  <pic:blipFill>
+                    <a:blip r:embed="rId26"/>
+                    <a:stretch>
+                      <a:fillRect/>
+                    </a:stretch>
+                  </pic:blipFill>
+                  <pic:spPr>
+                    <a:xfrm>
+                      <a:off x="0" y="0"/>
+                      <a:ext cx="5040000" cy="2619931"/>
+                    </a:xfrm>
+                    <a:prstGeom prst="rect"/>
+                  </pic:spPr>
+                </pic:pic>
+              </a:graphicData>
+            </a:graphic>
+          </wp:inline>
+        </w:drawing>
+      </w:r>
+    </w:p>
+    <w:p>
+      <w:pPr>
+        <w:pStyle w:val="APAGraphorFigure"/>
+        <w:jc w:val="center"/>
+      </w:pPr>
+      <w:r>
+        <w:rPr>
+          <w:i/>
+          <w:sz w:val="18"/>
+        </w:rPr>
+        <w:t>Figura 11. La prueba de la malla, ejecutada sola: 5 de 5, y las tres capturas que deja escritas como evidencia. Es la que levanta tres navegadores con WebRTC real.</w:t>
+      </w:r>
+    </w:p>
+    <w:p>
+      <w:pPr>
+        <w:jc w:val="center"/>
+      </w:pPr>
+      <w:r>
+        <w:drawing>
+          <wp:inline xmlns:a="http://schemas.openxmlformats.org/drawingml/2006/main" xmlns:pic="http://schemas.openxmlformats.org/drawingml/2006/picture">
+            <wp:extent cx="5040000" cy="3164736"/>
+            <wp:docPr id="12" name="Picture 12"/>
+            <wp:cNvGraphicFramePr>
+              <a:graphicFrameLocks noChangeAspect="1"/>
+            </wp:cNvGraphicFramePr>
+            <a:graphic>
+              <a:graphicData uri="http://schemas.openxmlformats.org/drawingml/2006/picture">
+                <pic:pic>
+                  <pic:nvPicPr>
+                    <pic:cNvPr id="0" name="15-distribuida-consola.png"/>
+                    <pic:cNvPicPr/>
+                  </pic:nvPicPr>
+                  <pic:blipFill>
+                    <a:blip r:embed="rId27"/>
+                    <a:stretch>
+                      <a:fillRect/>
+                    </a:stretch>
+                  </pic:blipFill>
+                  <pic:spPr>
+                    <a:xfrm>
+                      <a:off x="0" y="0"/>
+                      <a:ext cx="5040000" cy="3164736"/>
+                    </a:xfrm>
+                    <a:prstGeom prst="rect"/>
+                  </pic:spPr>
+                </pic:pic>
+              </a:graphicData>
+            </a:graphic>
+          </wp:inline>
+        </w:drawing>
+      </w:r>
+    </w:p>
+    <w:p>
+      <w:pPr>
+        <w:pStyle w:val="APAGraphorFigure"/>
+        <w:jc w:val="center"/>
+      </w:pPr>
+      <w:r>
+        <w:rPr>
+          <w:i/>
+          <w:sz w:val="18"/>
+        </w:rPr>
+        <w:t>Figura 12. Validación distribuida en consola: las mediciones de coste con 3, 5 y 10 nodos, y 7 de 7 propiedades verificadas.</w:t>
+      </w:r>
+    </w:p>
+    <w:p>
+      <w:pPr>
+        <w:jc w:val="center"/>
+      </w:pPr>
+      <w:r>
+        <w:drawing>
+          <wp:inline xmlns:a="http://schemas.openxmlformats.org/drawingml/2006/main" xmlns:pic="http://schemas.openxmlformats.org/drawingml/2006/picture">
             <wp:extent cx="5040000" cy="6219329"/>
-            <wp:docPr id="10" name="Picture 10"/>
+            <wp:docPr id="13" name="Picture 13"/>
             <wp:cNvGraphicFramePr>
               <a:graphicFrameLocks noChangeAspect="1"/>
             </wp:cNvGraphicFramePr>
@@ -3279,7 +3435,7 @@
                     <pic:cNvPicPr/>
                   </pic:nvPicPr>
                   <pic:blipFill>
-                    <a:blip r:embed="rId25"/>
+                    <a:blip r:embed="rId28"/>
                     <a:stretch>
                       <a:fillRect/>
                     </a:stretch>
@@ -3308,7 +3464,7 @@
           <w:i/>
           <w:sz w:val="18"/>
         </w:rPr>
-        <w:t>Figura 10. Las 22 pruebas de Cypress, una a una: malla de tres nodos, aforo de diez, partida local y menú. Cero fallos.</w:t>
+        <w:t>Figura 13. Las 22 pruebas de Cypress, una a una: malla de tres nodos, aforo de diez, partida local y menú. Cero fallos.</w:t>
       </w:r>
     </w:p>
     <w:p>
@@ -3319,7 +3475,7 @@
         <w:drawing>
           <wp:inline xmlns:a="http://schemas.openxmlformats.org/drawingml/2006/main" xmlns:pic="http://schemas.openxmlformats.org/drawingml/2006/picture">
             <wp:extent cx="5400000" cy="3410526"/>
-            <wp:docPr id="11" name="Picture 11"/>
+            <wp:docPr id="14" name="Picture 14"/>
             <wp:cNvGraphicFramePr>
               <a:graphicFrameLocks noChangeAspect="1"/>
             </wp:cNvGraphicFramePr>
@@ -3331,7 +3487,7 @@
                     <pic:cNvPicPr/>
                   </pic:nvPicPr>
                   <pic:blipFill>
-                    <a:blip r:embed="rId26"/>
+                    <a:blip r:embed="rId29"/>
                     <a:stretch>
                       <a:fillRect/>
                     </a:stretch>
@@ -3360,7 +3516,7 @@
           <w:i/>
           <w:sz w:val="18"/>
         </w:rPr>
-        <w:t>Figura 11. Burp Suite en medio de una partida: solo aparecen los saludos de señalización. Ni una carta, ni una mano, ni el mazo.</w:t>
+        <w:t>Figura 14. Burp Suite en medio de una partida: solo aparecen los saludos de señalización. Ni una carta, ni una mano, ni el mazo.</w:t>
       </w:r>
     </w:p>
     <w:p>

</xml_diff>